<commit_message>
assignment 9 static keyword
Co-authored-by: Cursor <cursoragent@cursor.com>
</commit_message>
<xml_diff>
--- a/assignment 10/Assignment10_WrapperClasses.docx
+++ b/assignment 10/Assignment10_WrapperClasses.docx
@@ -32,14 +32,13 @@
         <w:jc w:val="center"/>
       </w:pPr>
       <w:r>
-        <w:rPr>
-          <w:sz w:val="24"/>
-        </w:rPr>
         <w:t>Name: Krishnan Madhuratnam</w:t>
         <w:br/>
         <w:t>Roll No: 25scs1003001176</w:t>
         <w:br/>
-        <w:t>Subject: Java Programming</w:t>
+        <w:t>Subject: Java</w:t>
+        <w:br/>
+        <w:t>Assignment Name: Assignment 10 – Wrapper Classes</w:t>
       </w:r>
     </w:p>
     <w:p>

</xml_diff>